<commit_message>
feat(w7): embed 9 additional images — TPGS Ch.8 callout/tables + Artikel 11 Table 1 + Artikel 12 5 visuals
Co-Authored-By: Claude Opus 4.7 (1M context) <noreply@anthropic.com>
</commit_message>
<xml_diff>
--- a/Critical Thinking of the Article/01079_Dzaki Muhammad Yusfian_Artikel 11.docx
+++ b/Critical Thinking of the Article/01079_Dzaki Muhammad Yusfian_Artikel 11.docx
@@ -2,7 +2,7 @@
 <file path=word/document.xml><?xml version="1.0" encoding="utf-8"?>
 <w:document xmlns:w="http://schemas.openxmlformats.org/wordprocessingml/2006/main" xmlns:m="http://schemas.openxmlformats.org/officeDocument/2006/math" xmlns:r="http://schemas.openxmlformats.org/officeDocument/2006/relationships" xmlns:o="urn:schemas-microsoft-com:office:office" xmlns:v="urn:schemas-microsoft-com:vml" xmlns:w10="urn:schemas-microsoft-com:office:word" xmlns:a="http://schemas.openxmlformats.org/drawingml/2006/main" xmlns:pic="http://schemas.openxmlformats.org/drawingml/2006/picture" xmlns:wp="http://schemas.openxmlformats.org/drawingml/2006/wordprocessingDrawing">
   <w:body>
-    <w:bookmarkStart w:id="44" w:name="critical-review-artikel-11"/>
+    <w:bookmarkStart w:id="47" w:name="critical-review-artikel-11"/>
     <w:p>
       <w:pPr>
         <w:pStyle w:val="Heading1"/>
@@ -959,7 +959,7 @@
     </w:p>
     <w:bookmarkEnd w:id="11"/>
     <w:bookmarkEnd w:id="12"/>
-    <w:bookmarkStart w:id="18" w:name="argumen-utama-strategic-fit-triad"/>
+    <w:bookmarkStart w:id="21" w:name="argumen-utama-strategic-fit-triad"/>
     <w:p>
       <w:pPr>
         <w:pStyle w:val="Heading2"/>
@@ -978,7 +978,7 @@
         <w:t xml:space="preserve">Strategic Fit Triad</w:t>
       </w:r>
     </w:p>
-    <w:bookmarkStart w:id="13" w:name="komponen-triad-yang-sebenarnya"/>
+    <w:bookmarkStart w:id="16" w:name="komponen-triad-yang-sebenarnya"/>
     <w:p>
       <w:pPr>
         <w:pStyle w:val="Heading3"/>
@@ -1233,8 +1233,187 @@
         <w:t xml:space="preserve">, yang sering tertinggal dalam diskusi strategi generik Porter.</w:t>
       </w:r>
     </w:p>
-    <w:bookmarkEnd w:id="13"/>
-    <w:bookmarkStart w:id="14" w:name="logika-fit-untuk-differentiation"/>
+    <w:p>
+      <w:pPr>
+        <w:pStyle w:val="CaptionedFigure"/>
+      </w:pPr>
+      <w:r>
+        <w:drawing>
+          <wp:inline>
+            <wp:extent cx="5791200" cy="6803610"/>
+            <wp:effectExtent b="0" l="0" r="0" t="0"/>
+            <wp:docPr descr="Tabel 1. The Integration among Competitive Strategies, Human Resource Strategies, and Reward Systems" title="" id="14" name="Picture"/>
+            <a:graphic>
+              <a:graphicData uri="http://schemas.openxmlformats.org/drawingml/2006/picture">
+                <pic:pic>
+                  <pic:nvPicPr>
+                    <pic:cNvPr descr="D:/DZAKI/S2/Sem.%201/Manajemen%20Strategik/Dev%20Assistant/temp/ch8_figures/art11_table_1.png" id="15" name="Picture"/>
+                    <pic:cNvPicPr>
+                      <a:picLocks noChangeArrowheads="1" noChangeAspect="1"/>
+                    </pic:cNvPicPr>
+                  </pic:nvPicPr>
+                  <pic:blipFill>
+                    <a:blip r:embed="rId13"/>
+                    <a:stretch>
+                      <a:fillRect/>
+                    </a:stretch>
+                  </pic:blipFill>
+                  <pic:spPr bwMode="auto">
+                    <a:xfrm>
+                      <a:off x="0" y="0"/>
+                      <a:ext cx="5791200" cy="6803610"/>
+                    </a:xfrm>
+                    <a:prstGeom prst="rect">
+                      <a:avLst/>
+                    </a:prstGeom>
+                    <a:noFill/>
+                    <a:ln w="9525">
+                      <a:noFill/>
+                      <a:headEnd/>
+                      <a:tailEnd/>
+                    </a:ln>
+                  </pic:spPr>
+                </pic:pic>
+              </a:graphicData>
+            </a:graphic>
+          </wp:inline>
+        </w:drawing>
+      </w:r>
+    </w:p>
+    <w:p>
+      <w:pPr>
+        <w:pStyle w:val="ImageCaption"/>
+      </w:pPr>
+      <w:r>
+        <w:rPr>
+          <w:i/>
+          <w:iCs/>
+        </w:rPr>
+        <w:t xml:space="preserve">Tabel 1. The Integration among Competitive Strategies, Human Resource Strategies, and Reward Systems</w:t>
+      </w:r>
+    </w:p>
+    <w:p>
+      <w:pPr>
+        <w:pStyle w:val="BodyText"/>
+      </w:pPr>
+      <w:r>
+        <w:rPr>
+          <w:i/>
+          <w:iCs/>
+        </w:rPr>
+        <w:t xml:space="preserve">Sumber: Hsieh &amp; Chen (2011), Academy of Strategic Management Journal, 10(2): 26</w:t>
+      </w:r>
+    </w:p>
+    <w:p>
+      <w:pPr>
+        <w:pStyle w:val="BodyText"/>
+      </w:pPr>
+      <w:r>
+        <w:t xml:space="preserve">Tabel 1 adalah sintesis visual dari seluruh argumen Hsieh dan Chen. Matriks tiga-kolom ini memetakan setiap strategi kompetitif Porter (</w:t>
+      </w:r>
+      <w:r>
+        <w:rPr>
+          <w:i/>
+          <w:iCs/>
+        </w:rPr>
+        <w:t xml:space="preserve">Differentiation</w:t>
+      </w:r>
+      <w:r>
+        <w:t xml:space="preserve">,</w:t>
+      </w:r>
+      <w:r>
+        <w:t xml:space="preserve"> </w:t>
+      </w:r>
+      <w:r>
+        <w:rPr>
+          <w:i/>
+          <w:iCs/>
+        </w:rPr>
+        <w:t xml:space="preserve">Overall Cost Leadership</w:t>
+      </w:r>
+      <w:r>
+        <w:t xml:space="preserve">,</w:t>
+      </w:r>
+      <w:r>
+        <w:t xml:space="preserve"> </w:t>
+      </w:r>
+      <w:r>
+        <w:rPr>
+          <w:i/>
+          <w:iCs/>
+        </w:rPr>
+        <w:t xml:space="preserve">Focus</w:t>
+      </w:r>
+      <w:r>
+        <w:t xml:space="preserve">) ke konfigurasi</w:t>
+      </w:r>
+      <w:r>
+        <w:t xml:space="preserve"> </w:t>
+      </w:r>
+      <w:r>
+        <w:rPr>
+          <w:i/>
+          <w:iCs/>
+        </w:rPr>
+        <w:t xml:space="preserve">HR strategy</w:t>
+      </w:r>
+      <w:r>
+        <w:t xml:space="preserve"> </w:t>
+      </w:r>
+      <w:r>
+        <w:t xml:space="preserve">dan</w:t>
+      </w:r>
+      <w:r>
+        <w:t xml:space="preserve"> </w:t>
+      </w:r>
+      <w:r>
+        <w:rPr>
+          <w:i/>
+          <w:iCs/>
+        </w:rPr>
+        <w:t xml:space="preserve">reward system</w:t>
+      </w:r>
+      <w:r>
+        <w:t xml:space="preserve"> </w:t>
+      </w:r>
+      <w:r>
+        <w:t xml:space="preserve">yang dihipotesiskan sebagai</w:t>
+      </w:r>
+      <w:r>
+        <w:t xml:space="preserve"> </w:t>
+      </w:r>
+      <w:r>
+        <w:rPr>
+          <w:i/>
+          <w:iCs/>
+        </w:rPr>
+        <w:t xml:space="preserve">fit</w:t>
+      </w:r>
+      <w:r>
+        <w:t xml:space="preserve"> </w:t>
+      </w:r>
+      <w:r>
+        <w:t xml:space="preserve">yang konsisten. Tanpa tabel ini, klaim</w:t>
+      </w:r>
+      <w:r>
+        <w:t xml:space="preserve"> </w:t>
+      </w:r>
+      <w:r>
+        <w:rPr>
+          <w:i/>
+          <w:iCs/>
+        </w:rPr>
+        <w:t xml:space="preserve">configurational triad</w:t>
+      </w:r>
+      <w:r>
+        <w:t xml:space="preserve"> </w:t>
+      </w:r>
+      <w:r>
+        <w:t xml:space="preserve">sulit dipahami secara penuh — seluruh evaluasi kritis pada §§5–7 berikutnya bersandar pada strukturnya.</w:t>
+      </w:r>
+    </w:p>
+    <w:bookmarkEnd w:id="16"/>
+    <w:bookmarkStart w:id="17" w:name="logika-fit-untuk-differentiation"/>
     <w:p>
       <w:pPr>
         <w:pStyle w:val="Heading3"/>
@@ -1499,8 +1678,8 @@
         <w:t xml:space="preserve">Miles dan Snow (1978) yang menekankan eksperimen pasar dan adaptasi cepat.</w:t>
       </w:r>
     </w:p>
-    <w:bookmarkEnd w:id="14"/>
-    <w:bookmarkStart w:id="15" w:name="logika-fit-untuk-overall-cost-leadership"/>
+    <w:bookmarkEnd w:id="17"/>
+    <w:bookmarkStart w:id="18" w:name="logika-fit-untuk-overall-cost-leadership"/>
     <w:p>
       <w:pPr>
         <w:pStyle w:val="Heading3"/>
@@ -1739,8 +1918,8 @@
         <w:t xml:space="preserve">langsung tanpa investasi jangka panjang.</w:t>
       </w:r>
     </w:p>
-    <w:bookmarkEnd w:id="15"/>
-    <w:bookmarkStart w:id="16" w:name="logika-fit-untuk-focus"/>
+    <w:bookmarkEnd w:id="18"/>
+    <w:bookmarkStart w:id="19" w:name="logika-fit-untuk-focus"/>
     <w:p>
       <w:pPr>
         <w:pStyle w:val="Heading3"/>
@@ -1963,8 +2142,8 @@
         <w:t xml:space="preserve">Dowling dan Schuler (1990).</w:t>
       </w:r>
     </w:p>
-    <w:bookmarkEnd w:id="16"/>
-    <w:bookmarkStart w:id="17" w:name="hipotesis-konfigurasional"/>
+    <w:bookmarkEnd w:id="19"/>
+    <w:bookmarkStart w:id="20" w:name="hipotesis-konfigurasional"/>
     <w:p>
       <w:pPr>
         <w:pStyle w:val="Heading3"/>
@@ -2199,9 +2378,9 @@
         <w:t xml:space="preserve">— sebuah klaim teoretis yang ambisius tetapi memerlukan verifikasi empiris pada beragam industri dan konteks.</w:t>
       </w:r>
     </w:p>
-    <w:bookmarkEnd w:id="17"/>
-    <w:bookmarkEnd w:id="18"/>
-    <w:bookmarkStart w:id="21" w:name="koneksi-ke-topik-silabus-pertemuan-7"/>
+    <w:bookmarkEnd w:id="20"/>
+    <w:bookmarkEnd w:id="21"/>
+    <w:bookmarkStart w:id="24" w:name="koneksi-ke-topik-silabus-pertemuan-7"/>
     <w:p>
       <w:pPr>
         <w:pStyle w:val="Heading2"/>
@@ -2210,7 +2389,7 @@
         <w:t xml:space="preserve">§4 Koneksi ke Topik Silabus (Pertemuan 7)</w:t>
       </w:r>
     </w:p>
-    <w:bookmarkStart w:id="19" w:name="Xc099896cf1f2242e5486da480322d38bfbfb086"/>
+    <w:bookmarkStart w:id="22" w:name="Xc099896cf1f2242e5486da480322d38bfbfb086"/>
     <w:p>
       <w:pPr>
         <w:pStyle w:val="Heading3"/>
@@ -2459,8 +2638,8 @@
         <w:t xml:space="preserve">memberikan panduan operasional untuk memastikan kesehatan tersebut. Tanpa pijakan konseptual demikian, manajemen korporat hanya akan menerima laporan kinerja kuantitatif tanpa kerangka diagnostik untuk memahami akar masalah eksekusi di unit-unit bisnisnya.</w:t>
       </w:r>
     </w:p>
-    <w:bookmarkEnd w:id="19"/>
-    <w:bookmarkStart w:id="20" w:name="linking-ke-9-rmk-ke-artikel-ini"/>
+    <w:bookmarkEnd w:id="22"/>
+    <w:bookmarkStart w:id="23" w:name="linking-ke-9-rmk-ke-artikel-ini"/>
     <w:p>
       <w:pPr>
         <w:pStyle w:val="Heading3"/>
@@ -2654,9 +2833,9 @@
         <w:t xml:space="preserve">tiga level yang lengkap.</w:t>
       </w:r>
     </w:p>
-    <w:bookmarkEnd w:id="20"/>
-    <w:bookmarkEnd w:id="21"/>
-    <w:bookmarkStart w:id="25" w:name="kekuatan-artikel"/>
+    <w:bookmarkEnd w:id="23"/>
+    <w:bookmarkEnd w:id="24"/>
+    <w:bookmarkStart w:id="28" w:name="kekuatan-artikel"/>
     <w:p>
       <w:pPr>
         <w:pStyle w:val="Heading2"/>
@@ -2665,7 +2844,7 @@
         <w:t xml:space="preserve">§5 Kekuatan Artikel</w:t>
       </w:r>
     </w:p>
-    <w:bookmarkStart w:id="22" w:name="X7b427472b161e1aa871050af9ae81439fa43c08"/>
+    <w:bookmarkStart w:id="25" w:name="X7b427472b161e1aa871050af9ae81439fa43c08"/>
     <w:p>
       <w:pPr>
         <w:pStyle w:val="Heading3"/>
@@ -2759,8 +2938,8 @@
         <w:t xml:space="preserve">spesifik dapat dirumuskan, dan riset empiris dapat menargetkan konfigurasi tertentu daripada hanya menguji pasangan dua-dua. Bagi pembelajar strategi, sintesis ini juga membentuk kerangka mental yang lebih ringkas — satu Tabel 1 menggantikan kebutuhan menghafal lima atau enam tipologi paralel.</w:t>
       </w:r>
     </w:p>
-    <w:bookmarkEnd w:id="22"/>
-    <w:bookmarkStart w:id="23" w:name="X699a4ae7299daaed7ffcb5ffab6660aeb8579f1"/>
+    <w:bookmarkEnd w:id="25"/>
+    <w:bookmarkStart w:id="26" w:name="X699a4ae7299daaed7ffcb5ffab6660aeb8579f1"/>
     <w:p>
       <w:pPr>
         <w:pStyle w:val="Heading3"/>
@@ -3014,8 +3193,8 @@
         <w:t xml:space="preserve">yang sering muncul dalam praktik.</w:t>
       </w:r>
     </w:p>
-    <w:bookmarkEnd w:id="23"/>
-    <w:bookmarkStart w:id="24" w:name="akar-teoretis-yang-solid"/>
+    <w:bookmarkEnd w:id="26"/>
+    <w:bookmarkStart w:id="27" w:name="akar-teoretis-yang-solid"/>
     <w:p>
       <w:pPr>
         <w:pStyle w:val="Heading3"/>
@@ -3106,9 +3285,9 @@
         <w:t xml:space="preserve">— ia diturunkan dari rantai teori yang mapan dan didukung referensi lintas-aliran. Akar yang demikian luas membuat artikel cocok sebagai pintu masuk pembelajar untuk menelusuri literatur strategi dan HR yang lebih luas.</w:t>
       </w:r>
     </w:p>
-    <w:bookmarkEnd w:id="24"/>
-    <w:bookmarkEnd w:id="25"/>
-    <w:bookmarkStart w:id="31" w:name="keterbatasan-dan-kelemahan"/>
+    <w:bookmarkEnd w:id="27"/>
+    <w:bookmarkEnd w:id="28"/>
+    <w:bookmarkStart w:id="34" w:name="keterbatasan-dan-kelemahan"/>
     <w:p>
       <w:pPr>
         <w:pStyle w:val="Heading2"/>
@@ -3117,7 +3296,7 @@
         <w:t xml:space="preserve">§6 Keterbatasan dan Kelemahan</w:t>
       </w:r>
     </w:p>
-    <w:bookmarkStart w:id="26" w:name="sifat-konseptual-tanpa-uji-empiris"/>
+    <w:bookmarkStart w:id="29" w:name="sifat-konseptual-tanpa-uji-empiris"/>
     <w:p>
       <w:pPr>
         <w:pStyle w:val="Heading3"/>
@@ -3211,8 +3390,8 @@
         <w:t xml:space="preserve">, retensi karyawan, atau ukuran lain. Ambiguitas variabel terikat ini memperburuk problem epistemologis yang sudah ada karena sifat artikel yang konseptual.</w:t>
       </w:r>
     </w:p>
-    <w:bookmarkEnd w:id="26"/>
-    <w:bookmarkStart w:id="27" w:name="pengabaian-dinamika-temporal"/>
+    <w:bookmarkEnd w:id="29"/>
+    <w:bookmarkStart w:id="30" w:name="pengabaian-dinamika-temporal"/>
     <w:p>
       <w:pPr>
         <w:pStyle w:val="Heading3"/>
@@ -3460,8 +3639,8 @@
         <w:t xml:space="preserve">paling kritis muncul dan kebutuhan akan kerangka diagnostik paling besar.</w:t>
       </w:r>
     </w:p>
-    <w:bookmarkEnd w:id="27"/>
-    <w:bookmarkStart w:id="28" w:name="ketergantungan-pada-porters-typology"/>
+    <w:bookmarkEnd w:id="30"/>
+    <w:bookmarkStart w:id="31" w:name="ketergantungan-pada-porters-typology"/>
     <w:p>
       <w:pPr>
         <w:pStyle w:val="Heading3"/>
@@ -3671,8 +3850,8 @@
         <w:t xml:space="preserve">yang dibangun di atasnya juga harus diperbarui.</w:t>
       </w:r>
     </w:p>
-    <w:bookmarkEnd w:id="28"/>
-    <w:bookmarkStart w:id="29" w:name="konteks-kultural-tidak-dibahas"/>
+    <w:bookmarkEnd w:id="31"/>
+    <w:bookmarkStart w:id="32" w:name="konteks-kultural-tidak-dibahas"/>
     <w:p>
       <w:pPr>
         <w:pStyle w:val="Heading3"/>
@@ -3907,8 +4086,8 @@
         <w:t xml:space="preserve">agar selaras dengan ekspektasi sosial setempat. Tanpa langkah ini, kerangka beresiko menjadi rekomendasi yang baik di atas kertas tetapi gagal saat diimplementasi karena tidak memperhitungkan kontrak psikologis dan norma kelembagaan lokal.</w:t>
       </w:r>
     </w:p>
-    <w:bookmarkEnd w:id="29"/>
-    <w:bookmarkStart w:id="30" w:name="tidak-ada-diskusi-reverse-causality"/>
+    <w:bookmarkEnd w:id="32"/>
+    <w:bookmarkStart w:id="33" w:name="tidak-ada-diskusi-reverse-causality"/>
     <w:p>
       <w:pPr>
         <w:pStyle w:val="Heading3"/>
@@ -4150,9 +4329,9 @@
         <w:t xml:space="preserve">. Tanpa kesadaran ini, riset lanjutan dapat menghasilkan korelasi yang dianggap konfirmasi padahal sebenarnya artefak desain. Dengan demikian, kelemahan ini bukan sekadar masalah teoretis abstrak; ia berdampak pada bagaimana komunitas riset membangun bukti empiris atas kerangka — dan, pada gilirannya, pada kepercayaan praktisi untuk mengadopsi rekomendasi yang diturunkan dari kerangka.</w:t>
       </w:r>
     </w:p>
-    <w:bookmarkEnd w:id="30"/>
-    <w:bookmarkEnd w:id="31"/>
-    <w:bookmarkStart w:id="36" w:name="evaluasi-kritis"/>
+    <w:bookmarkEnd w:id="33"/>
+    <w:bookmarkEnd w:id="34"/>
+    <w:bookmarkStart w:id="39" w:name="evaluasi-kritis"/>
     <w:p>
       <w:pPr>
         <w:pStyle w:val="Heading2"/>
@@ -4161,7 +4340,7 @@
         <w:t xml:space="preserve">§7 Evaluasi Kritis</w:t>
       </w:r>
     </w:p>
-    <w:bookmarkStart w:id="32" w:name="X25c92dae052cdc1f9331664647123ab7b78f1e9"/>
+    <w:bookmarkStart w:id="35" w:name="X25c92dae052cdc1f9331664647123ab7b78f1e9"/>
     <w:p>
       <w:pPr>
         <w:pStyle w:val="Heading3"/>
@@ -4556,8 +4735,8 @@
         <w:t xml:space="preserve">) mengizinkan substitusi parsial antar elemen. Pilihan perspektif menentukan bagaimana pengujian dilakukan dan bagaimana rekomendasi praktik dirumuskan.</w:t>
       </w:r>
     </w:p>
-    <w:bookmarkEnd w:id="32"/>
-    <w:bookmarkStart w:id="33" w:name="masalah-operasionalisasi"/>
+    <w:bookmarkEnd w:id="35"/>
+    <w:bookmarkStart w:id="36" w:name="masalah-operasionalisasi"/>
     <w:p>
       <w:pPr>
         <w:pStyle w:val="Heading3"/>
@@ -4731,8 +4910,8 @@
         <w:t xml:space="preserve">. Ketidakkonsistenan demikian akan merusak kredibilitas kerangka bila digunakan sebagai dasar keputusan kompensasi atau evaluasi unit bisnis.</w:t>
       </w:r>
     </w:p>
-    <w:bookmarkEnd w:id="33"/>
-    <w:bookmarkStart w:id="34" w:name="apa-yang-seharusnya-dilakukan"/>
+    <w:bookmarkEnd w:id="36"/>
+    <w:bookmarkStart w:id="37" w:name="apa-yang-seharusnya-dilakukan"/>
     <w:p>
       <w:pPr>
         <w:pStyle w:val="Heading3"/>
@@ -5005,8 +5184,8 @@
         <w:t xml:space="preserve">tetap berstatus proposisi yang menjanjikan tetapi belum terverifikasi — dan komunitas riset strategi-HR akan kesulitan membangun pengetahuan kumulatif di atas kerangka yang tidak terverifikasi.</w:t>
       </w:r>
     </w:p>
-    <w:bookmarkEnd w:id="34"/>
-    <w:bookmarkStart w:id="35" w:name="penilaian-kontribusi-orisinal"/>
+    <w:bookmarkEnd w:id="37"/>
+    <w:bookmarkStart w:id="38" w:name="penilaian-kontribusi-orisinal"/>
     <w:p>
       <w:pPr>
         <w:pStyle w:val="Heading3"/>
@@ -5091,9 +5270,9 @@
         <w:t xml:space="preserve">. Dengan kata lain, artikel layak dikutip dalam telaah literatur, didiskusikan di ruang kelas, dan dijadikan pijakan rancangan riset — tetapi tidak boleh menjadi otoritas tunggal yang membenarkan keputusan restrukturisasi HR yang berdampak pada ribuan karyawan tanpa verifikasi empiris pendukung. Posisi tier 2 demikian bukan kelemahan fatal; banyak kerangka konseptual yang menjadi pijakan teori produktif justru memulai jalur perjalanan empirisnya pada posisi serupa. Yang penting adalah kejujuran dalam memposisikan kontribusi dan tanggung jawab komunitas akademik untuk mengangkatnya ke tier 1 melalui penelitian lanjutan yang dirancang secara metodologis ketat.</w:t>
       </w:r>
     </w:p>
-    <w:bookmarkEnd w:id="35"/>
-    <w:bookmarkEnd w:id="36"/>
-    <w:bookmarkStart w:id="40" w:name="X08ce25e3f5d53481848f16121df5d913eaf4e5d"/>
+    <w:bookmarkEnd w:id="38"/>
+    <w:bookmarkEnd w:id="39"/>
+    <w:bookmarkStart w:id="43" w:name="X08ce25e3f5d53481848f16121df5d913eaf4e5d"/>
     <w:p>
       <w:pPr>
         <w:pStyle w:val="Heading2"/>
@@ -5102,7 +5281,7 @@
         <w:t xml:space="preserve">§8 Implikasi bagi Pemahaman Manajemen Strategik</w:t>
       </w:r>
     </w:p>
-    <w:bookmarkStart w:id="37" w:name="implikasi-teoretis"/>
+    <w:bookmarkStart w:id="40" w:name="implikasi-teoretis"/>
     <w:p>
       <w:pPr>
         <w:pStyle w:val="Heading3"/>
@@ -5215,8 +5394,8 @@
         <w:t xml:space="preserve">sebagai bagian integral kurikulum strategi, bukan sebagai mata kuliah pelengkap di luar inti.</w:t>
       </w:r>
     </w:p>
-    <w:bookmarkEnd w:id="37"/>
-    <w:bookmarkStart w:id="38" w:name="implikasi-manajerial"/>
+    <w:bookmarkEnd w:id="40"/>
+    <w:bookmarkStart w:id="41" w:name="implikasi-manajerial"/>
     <w:p>
       <w:pPr>
         <w:pStyle w:val="Heading3"/>
@@ -5419,8 +5598,8 @@
         <w:t xml:space="preserve">sudah merusak motivasi dan retensi karyawan kunci.</w:t>
       </w:r>
     </w:p>
-    <w:bookmarkEnd w:id="38"/>
-    <w:bookmarkStart w:id="39" w:name="implikasi-untuk-konteks-indonesia"/>
+    <w:bookmarkEnd w:id="41"/>
+    <w:bookmarkStart w:id="42" w:name="implikasi-untuk-konteks-indonesia"/>
     <w:p>
       <w:pPr>
         <w:pStyle w:val="Heading3"/>
@@ -5879,9 +6058,9 @@
         <w:t xml:space="preserve">artikel.</w:t>
       </w:r>
     </w:p>
-    <w:bookmarkEnd w:id="39"/>
-    <w:bookmarkEnd w:id="40"/>
-    <w:bookmarkStart w:id="43" w:name="X9715f5477454b0f18f77c34a9fa9ac7a18408da"/>
+    <w:bookmarkEnd w:id="42"/>
+    <w:bookmarkEnd w:id="43"/>
+    <w:bookmarkStart w:id="46" w:name="X9715f5477454b0f18f77c34a9fa9ac7a18408da"/>
     <w:p>
       <w:pPr>
         <w:pStyle w:val="Heading2"/>
@@ -5890,7 +6069,7 @@
         <w:t xml:space="preserve">§9 Isu untuk Didebatkan dan Didiskusikan Lebih Lanjut</w:t>
       </w:r>
     </w:p>
-    <w:bookmarkStart w:id="41" w:name="pertanyaan-terbuka"/>
+    <w:bookmarkStart w:id="44" w:name="pertanyaan-terbuka"/>
     <w:p>
       <w:pPr>
         <w:pStyle w:val="Heading3"/>
@@ -6158,8 +6337,8 @@
         <w:t xml:space="preserve">— yang oleh literatur kontemporer dianggap semakin lazim di industri jasa dan digital? Pertanyaan-pertanyaan ini layak menjadi bahan diskusi kelas Magister Akuntansi karena masing-masing membuka jalur penelitian empiris yang spesifik dan kontekstual.</w:t>
       </w:r>
     </w:p>
-    <w:bookmarkEnd w:id="41"/>
-    <w:bookmarkStart w:id="42" w:name="relevansi-untuk-riset-indonesia"/>
+    <w:bookmarkEnd w:id="44"/>
+    <w:bookmarkStart w:id="45" w:name="relevansi-untuk-riset-indonesia"/>
     <w:p>
       <w:pPr>
         <w:pStyle w:val="Heading3"/>
@@ -6418,9 +6597,9 @@
         <w:t xml:space="preserve">bertahan, runtuh, atau memerlukan modifikasi ketika strategi dan struktur korporat berubah secara simultan.</w:t>
       </w:r>
     </w:p>
-    <w:bookmarkEnd w:id="42"/>
-    <w:bookmarkEnd w:id="43"/>
-    <w:bookmarkEnd w:id="44"/>
+    <w:bookmarkEnd w:id="45"/>
+    <w:bookmarkEnd w:id="46"/>
+    <w:bookmarkEnd w:id="47"/>
     <w:sectPr>
       <w:pgSz w:h="15840" w:w="12240"/>
       <w:pgMar w:bottom="1417" w:footer="720" w:gutter="0" w:header="720" w:left="1701" w:right="1417" w:top="1701"/>

</xml_diff>